<commit_message>
Give the Sat-Raj contract its own résumé entry
Five bullets covering the dispatch-to-QuickBooks billing system, the pricing
engine, DTN and Samsara intake, the review queue, and ongoing production
work. Rocket Devs keeps the Indiecator work. Dropped the two Projects lines
that now repeat experience bullets so it stays on one page.

Co-Authored-By: Claude Opus 5.5 <noreply@anthropic.com>
</commit_message>
<xml_diff>
--- a/public/uzair-saleem-resume.docx
+++ b/public/uzair-saleem-resume.docx
@@ -58,7 +58,7 @@
         </w:rPr>
         <w:t xml:space="preserve">  |  </w:t>
       </w:r>
-      <w:hyperlink w:history="1" r:id="rIdg08ndhymhjtvz16ffej1z">
+      <w:hyperlink w:history="1" r:id="rIdmzpg7x_qeyxjspstg1ndm">
         <w:r>
           <w:rPr>
             <w:rFonts w:ascii="Calibri" w:cs="Calibri" w:eastAsia="Calibri" w:hAnsi="Calibri"/>
@@ -79,7 +79,7 @@
         </w:rPr>
         <w:t xml:space="preserve">  |  </w:t>
       </w:r>
-      <w:hyperlink w:history="1" r:id="rIdyxukxvtmavwx2j_ennhoq">
+      <w:hyperlink w:history="1" r:id="rIdh_h9gh1km70aioqqhnhvy">
         <w:r>
           <w:rPr>
             <w:rFonts w:ascii="Calibri" w:cs="Calibri" w:eastAsia="Calibri" w:hAnsi="Calibri"/>
@@ -100,7 +100,7 @@
         </w:rPr>
         <w:t xml:space="preserve">  |  </w:t>
       </w:r>
-      <w:hyperlink w:history="1" r:id="rIdhvbponbl6zvmtybnkl4ko">
+      <w:hyperlink w:history="1" r:id="rId7lnotrpqncbmvt9dno5sm">
         <w:r>
           <w:rPr>
             <w:rFonts w:ascii="Calibri" w:cs="Calibri" w:eastAsia="Calibri" w:hAnsi="Calibri"/>
@@ -121,7 +121,7 @@
         </w:rPr>
         <w:t xml:space="preserve">  |  </w:t>
       </w:r>
-      <w:hyperlink w:history="1" r:id="rIdehmumfz5dgkh5jqicdvqk">
+      <w:hyperlink w:history="1" r:id="rIdwwegwqvvd5essceqa_z9t">
         <w:r>
           <w:rPr>
             <w:rFonts w:ascii="Calibri" w:cs="Calibri" w:eastAsia="Calibri" w:hAnsi="Calibri"/>
@@ -142,7 +142,7 @@
         </w:rPr>
         <w:t xml:space="preserve">  |  </w:t>
       </w:r>
-      <w:hyperlink w:history="1" r:id="rIdssxwffwmg0uilgf57irx_">
+      <w:hyperlink w:history="1" r:id="rId1f4q8gkpnq7zpvcqst4tq">
         <w:r>
           <w:rPr>
             <w:rFonts w:ascii="Calibri" w:cs="Calibri" w:eastAsia="Calibri" w:hAnsi="Calibri"/>
@@ -198,17 +198,20 @@
         </w:tabs>
         <w:spacing w:after="0" w:before="100"/>
       </w:pPr>
-      <w:r>
-        <w:rPr>
-          <w:rFonts w:ascii="Calibri" w:cs="Calibri" w:eastAsia="Calibri" w:hAnsi="Calibri"/>
-          <w:b/>
-          <w:bCs/>
-          <w:color w:val="111111"/>
-          <w:sz w:val="21"/>
-          <w:szCs w:val="21"/>
-        </w:rPr>
-        <w:t xml:space="preserve">Rocket Devs</w:t>
-      </w:r>
+      <w:hyperlink w:history="1" r:id="rIdfurn0im8w3k6ile_wg6zd">
+        <w:r>
+          <w:rPr>
+            <w:rFonts w:ascii="Calibri" w:cs="Calibri" w:eastAsia="Calibri" w:hAnsi="Calibri"/>
+            <w:b/>
+            <w:bCs/>
+            <w:color w:val="111111"/>
+            <w:sz w:val="21"/>
+            <w:szCs w:val="21"/>
+            <w:u w:val="single"/>
+          </w:rPr>
+          <w:t xml:space="preserve">Sat-Raj, Inc. (satraj.inc)</w:t>
+        </w:r>
+      </w:hyperlink>
       <w:r>
         <w:rPr>
           <w:rFonts w:ascii="Calibri" w:cs="Calibri" w:eastAsia="Calibri" w:hAnsi="Calibri"/>
@@ -216,7 +219,7 @@
           <w:sz w:val="19"/>
           <w:szCs w:val="19"/>
         </w:rPr>
-        <w:t xml:space="preserve">	Jul 2025 – Present</w:t>
+        <w:t xml:space="preserve">	Jan 2026 – Present</w:t>
       </w:r>
     </w:p>
     <w:p>
@@ -235,7 +238,7 @@
           <w:sz w:val="21"/>
           <w:szCs w:val="21"/>
         </w:rPr>
-        <w:t xml:space="preserve">Full-Stack Engineer</w:t>
+        <w:t xml:space="preserve">Full-Stack Engineer, contract</w:t>
       </w:r>
       <w:r>
         <w:rPr>
@@ -246,7 +249,7 @@
           <w:sz w:val="19"/>
           <w:szCs w:val="19"/>
         </w:rPr>
-        <w:t xml:space="preserve">	Remote (US / EU)</w:t>
+        <w:t xml:space="preserve">	Remote (New Jersey, US)</w:t>
       </w:r>
     </w:p>
     <w:p>
@@ -267,29 +270,29 @@
           <w:sz w:val="20"/>
           <w:szCs w:val="20"/>
         </w:rPr>
-        <w:t xml:space="preserve">Engineered data intensive ETL pipelines for Indiecator (indiecator.com) that sync years of Stripe and Paddle billing history without downtime: a </w:t>
-      </w:r>
-      <w:r>
-        <w:rPr>
-          <w:rFonts w:ascii="Calibri" w:cs="Calibri" w:eastAsia="Calibri" w:hAnsi="Calibri"/>
-          <w:b/>
-          <w:bCs/>
-          <w:color w:val="111111"/>
-          <w:sz w:val="20"/>
-          <w:szCs w:val="20"/>
-        </w:rPr>
-        <w:t xml:space="preserve">2-year backfill</w:t>
-      </w:r>
-      <w:r>
-        <w:rPr>
-          <w:rFonts w:ascii="Calibri" w:cs="Calibri" w:eastAsia="Calibri" w:hAnsi="Calibri"/>
-          <w:b w:val="false"/>
-          <w:bCs w:val="false"/>
-          <w:color w:val="111111"/>
-          <w:sz w:val="20"/>
-          <w:szCs w:val="20"/>
-        </w:rPr>
-        <w:t xml:space="preserve">, live webhooks and a nightly reconciliation, all idempotent, into multi-tenant Postgres.</w:t>
+        <w:t xml:space="preserve">Integrated and shipped a complete billing workflow from dispatch to QuickBooks Desktop for a gasoline and diesel distributor in NJ and PA. </w:t>
+      </w:r>
+      <w:r>
+        <w:rPr>
+          <w:rFonts w:ascii="Calibri" w:cs="Calibri" w:eastAsia="Calibri" w:hAnsi="Calibri"/>
+          <w:b/>
+          <w:bCs/>
+          <w:color w:val="111111"/>
+          <w:sz w:val="20"/>
+          <w:szCs w:val="20"/>
+        </w:rPr>
+        <w:t xml:space="preserve">The whole office runs real invoices through it every day.</w:t>
+      </w:r>
+      <w:r>
+        <w:rPr>
+          <w:rFonts w:ascii="Calibri" w:cs="Calibri" w:eastAsia="Calibri" w:hAnsi="Calibri"/>
+          <w:b w:val="false"/>
+          <w:bCs w:val="false"/>
+          <w:color w:val="111111"/>
+          <w:sz w:val="20"/>
+          <w:szCs w:val="20"/>
+        </w:rPr>
+        <w:t xml:space="preserve"/>
       </w:r>
     </w:p>
     <w:p>
@@ -310,7 +313,7 @@
           <w:sz w:val="20"/>
           <w:szCs w:val="20"/>
         </w:rPr>
-        <w:t xml:space="preserve">Built the revenue ledger behind MRR, ARR, churn and retention from real invoices, so every number drills down to the customers behind it.</w:t>
+        <w:t xml:space="preserve">Built the pricing engine from rack costs, freight, margins and NJ/PA fuel taxes. It had to match the old spreadsheet to the cent, so the math is pinned to the legacy rates in tests.</w:t>
       </w:r>
     </w:p>
     <w:p>
@@ -331,87 +334,7 @@
           <w:sz w:val="20"/>
           <w:szCs w:val="20"/>
         </w:rPr>
-        <w:t xml:space="preserve">Integrated and shipped Satraj's complete billing workflow from dispatch to QuickBooks Desktop (satraj.inc). It handles messy data from DTN and Samsara, sends unclear deliveries to an office review queue, and syncs invoices with retries and duplicate checks. </w:t>
-      </w:r>
-      <w:r>
-        <w:rPr>
-          <w:rFonts w:ascii="Calibri" w:cs="Calibri" w:eastAsia="Calibri" w:hAnsi="Calibri"/>
-          <w:b/>
-          <w:bCs/>
-          <w:color w:val="111111"/>
-          <w:sz w:val="20"/>
-          <w:szCs w:val="20"/>
-        </w:rPr>
-        <w:t xml:space="preserve">The whole office runs real invoices through it.</w:t>
-      </w:r>
-      <w:r>
-        <w:rPr>
-          <w:rFonts w:ascii="Calibri" w:cs="Calibri" w:eastAsia="Calibri" w:hAnsi="Calibri"/>
-          <w:b w:val="false"/>
-          <w:bCs w:val="false"/>
-          <w:color w:val="111111"/>
-          <w:sz w:val="20"/>
-          <w:szCs w:val="20"/>
-        </w:rPr>
-        <w:t xml:space="preserve"/>
-      </w:r>
-    </w:p>
-    <w:p>
-      <w:pPr>
-        <w:tabs>
-          <w:tab w:val="right" w:pos="10800"/>
-        </w:tabs>
-        <w:spacing w:after="0" w:before="100"/>
-      </w:pPr>
-      <w:r>
-        <w:rPr>
-          <w:rFonts w:ascii="Calibri" w:cs="Calibri" w:eastAsia="Calibri" w:hAnsi="Calibri"/>
-          <w:b/>
-          <w:bCs/>
-          <w:color w:val="111111"/>
-          <w:sz w:val="21"/>
-          <w:szCs w:val="21"/>
-        </w:rPr>
-        <w:t xml:space="preserve">Design&amp;Desktop</w:t>
-      </w:r>
-      <w:r>
-        <w:rPr>
-          <w:rFonts w:ascii="Calibri" w:cs="Calibri" w:eastAsia="Calibri" w:hAnsi="Calibri"/>
-          <w:color w:val="555555"/>
-          <w:sz w:val="19"/>
-          <w:szCs w:val="19"/>
-        </w:rPr>
-        <w:t xml:space="preserve">	Jan 2025 – Jul 2025</w:t>
-      </w:r>
-    </w:p>
-    <w:p>
-      <w:pPr>
-        <w:tabs>
-          <w:tab w:val="right" w:pos="10800"/>
-        </w:tabs>
-        <w:spacing w:after="0" w:before="0"/>
-      </w:pPr>
-      <w:r>
-        <w:rPr>
-          <w:rFonts w:ascii="Calibri" w:cs="Calibri" w:eastAsia="Calibri" w:hAnsi="Calibri"/>
-          <w:i/>
-          <w:iCs/>
-          <w:color w:val="111111"/>
-          <w:sz w:val="21"/>
-          <w:szCs w:val="21"/>
-        </w:rPr>
-        <w:t xml:space="preserve">Full-Stack Engineer</w:t>
-      </w:r>
-      <w:r>
-        <w:rPr>
-          <w:rFonts w:ascii="Calibri" w:cs="Calibri" w:eastAsia="Calibri" w:hAnsi="Calibri"/>
-          <w:i/>
-          <w:iCs/>
-          <w:color w:val="555555"/>
-          <w:sz w:val="19"/>
-          <w:szCs w:val="19"/>
-        </w:rPr>
-        <w:t xml:space="preserve">	Remote (Germany)</w:t>
+        <w:t xml:space="preserve">Pulled supplier prices and delivery tickets from DTN and Samsara, so nothing gets retyped into Sheets and QuickBooks. Unclear GPS stops go to an office review queue instead of being guessed.</w:t>
       </w:r>
     </w:p>
     <w:p>
@@ -432,7 +355,7 @@
           <w:sz w:val="20"/>
           <w:szCs w:val="20"/>
         </w:rPr>
-        <w:t xml:space="preserve">Built an AI integrated reel generator and shipped its n8n workflow that posts finished reels to Instagram on a schedule.</w:t>
+        <w:t xml:space="preserve">Synced approved invoices to QuickBooks Desktop through the Web Connector with fuel and tax lines, retries and duplicate checks.</w:t>
       </w:r>
     </w:p>
     <w:p>
@@ -453,29 +376,65 @@
           <w:sz w:val="20"/>
           <w:szCs w:val="20"/>
         </w:rPr>
-        <w:t xml:space="preserve">Rebuilt the in-browser video pipeline on MediaBunny. Render time went from 2–10 minutes to </w:t>
-      </w:r>
-      <w:r>
-        <w:rPr>
-          <w:rFonts w:ascii="Calibri" w:cs="Calibri" w:eastAsia="Calibri" w:hAnsi="Calibri"/>
-          <w:b/>
-          <w:bCs/>
-          <w:color w:val="111111"/>
-          <w:sz w:val="20"/>
-          <w:szCs w:val="20"/>
-        </w:rPr>
-        <w:t xml:space="preserve">about 10 seconds</w:t>
-      </w:r>
-      <w:r>
-        <w:rPr>
-          <w:rFonts w:ascii="Calibri" w:cs="Calibri" w:eastAsia="Calibri" w:hAnsi="Calibri"/>
-          <w:b w:val="false"/>
-          <w:bCs w:val="false"/>
-          <w:color w:val="111111"/>
-          <w:sz w:val="20"/>
-          <w:szCs w:val="20"/>
-        </w:rPr>
-        <w:t xml:space="preserve"> per clip.</w:t>
+        <w:t xml:space="preserve">Own fixes and features in production, like repairing history after a terminal feed swapped gross and net gallons, a Top Tier additive charge and a payables view.</w:t>
+      </w:r>
+    </w:p>
+    <w:p>
+      <w:pPr>
+        <w:tabs>
+          <w:tab w:val="right" w:pos="10800"/>
+        </w:tabs>
+        <w:spacing w:after="0" w:before="100"/>
+      </w:pPr>
+      <w:r>
+        <w:rPr>
+          <w:rFonts w:ascii="Calibri" w:cs="Calibri" w:eastAsia="Calibri" w:hAnsi="Calibri"/>
+          <w:b/>
+          <w:bCs/>
+          <w:color w:val="111111"/>
+          <w:sz w:val="21"/>
+          <w:szCs w:val="21"/>
+        </w:rPr>
+        <w:t xml:space="preserve">Rocket Devs</w:t>
+      </w:r>
+      <w:r>
+        <w:rPr>
+          <w:rFonts w:ascii="Calibri" w:cs="Calibri" w:eastAsia="Calibri" w:hAnsi="Calibri"/>
+          <w:color w:val="555555"/>
+          <w:sz w:val="19"/>
+          <w:szCs w:val="19"/>
+        </w:rPr>
+        <w:t xml:space="preserve">	Jul 2025 – Present</w:t>
+      </w:r>
+    </w:p>
+    <w:p>
+      <w:pPr>
+        <w:tabs>
+          <w:tab w:val="right" w:pos="10800"/>
+        </w:tabs>
+        <w:spacing w:after="0" w:before="0"/>
+      </w:pPr>
+      <w:r>
+        <w:rPr>
+          <w:rFonts w:ascii="Calibri" w:cs="Calibri" w:eastAsia="Calibri" w:hAnsi="Calibri"/>
+          <w:i/>
+          <w:iCs/>
+          <w:color w:val="111111"/>
+          <w:sz w:val="21"/>
+          <w:szCs w:val="21"/>
+        </w:rPr>
+        <w:t xml:space="preserve">Full-Stack Engineer</w:t>
+      </w:r>
+      <w:r>
+        <w:rPr>
+          <w:rFonts w:ascii="Calibri" w:cs="Calibri" w:eastAsia="Calibri" w:hAnsi="Calibri"/>
+          <w:i/>
+          <w:iCs/>
+          <w:color w:val="555555"/>
+          <w:sz w:val="19"/>
+          <w:szCs w:val="19"/>
+        </w:rPr>
+        <w:t xml:space="preserve">	Remote (US / EU)</w:t>
       </w:r>
     </w:p>
     <w:p>
@@ -496,29 +455,29 @@
           <w:sz w:val="20"/>
           <w:szCs w:val="20"/>
         </w:rPr>
-        <w:t xml:space="preserve">Raised restaurant-data scraping throughput by </w:t>
-      </w:r>
-      <w:r>
-        <w:rPr>
-          <w:rFonts w:ascii="Calibri" w:cs="Calibri" w:eastAsia="Calibri" w:hAnsi="Calibri"/>
-          <w:b/>
-          <w:bCs/>
-          <w:color w:val="111111"/>
-          <w:sz w:val="20"/>
-          <w:szCs w:val="20"/>
-        </w:rPr>
-        <w:t xml:space="preserve">80%</w:t>
-      </w:r>
-      <w:r>
-        <w:rPr>
-          <w:rFonts w:ascii="Calibri" w:cs="Calibri" w:eastAsia="Calibri" w:hAnsi="Calibri"/>
-          <w:b w:val="false"/>
-          <w:bCs w:val="false"/>
-          <w:color w:val="111111"/>
-          <w:sz w:val="20"/>
-          <w:szCs w:val="20"/>
-        </w:rPr>
-        <w:t xml:space="preserve"> with parallel headless Chromium workers for a listings dashboard.</w:t>
+        <w:t xml:space="preserve">Engineered data intensive ETL pipelines for Indiecator (indiecator.com) that sync years of Stripe and Paddle billing history without downtime: a </w:t>
+      </w:r>
+      <w:r>
+        <w:rPr>
+          <w:rFonts w:ascii="Calibri" w:cs="Calibri" w:eastAsia="Calibri" w:hAnsi="Calibri"/>
+          <w:b/>
+          <w:bCs/>
+          <w:color w:val="111111"/>
+          <w:sz w:val="20"/>
+          <w:szCs w:val="20"/>
+        </w:rPr>
+        <w:t xml:space="preserve">2-year backfill</w:t>
+      </w:r>
+      <w:r>
+        <w:rPr>
+          <w:rFonts w:ascii="Calibri" w:cs="Calibri" w:eastAsia="Calibri" w:hAnsi="Calibri"/>
+          <w:b w:val="false"/>
+          <w:bCs w:val="false"/>
+          <w:color w:val="111111"/>
+          <w:sz w:val="20"/>
+          <w:szCs w:val="20"/>
+        </w:rPr>
+        <w:t xml:space="preserve">, live webhooks and a nightly reconciliation, all idempotent, into multi-tenant Postgres.</w:t>
       </w:r>
     </w:p>
     <w:p>
@@ -539,7 +498,7 @@
           <w:sz w:val="20"/>
           <w:szCs w:val="20"/>
         </w:rPr>
-        <w:t xml:space="preserve">Shipped per-warehouse delivery pricing and checkout address validation across 12,000 postal codes for a German B2B marketplace.</w:t>
+        <w:t xml:space="preserve">Built the revenue ledger behind MRR, ARR, churn and retention from real invoices, so every number drills down to the customers behind it.</w:t>
       </w:r>
     </w:p>
     <w:p>
@@ -558,7 +517,7 @@
           <w:sz w:val="21"/>
           <w:szCs w:val="21"/>
         </w:rPr>
-        <w:t xml:space="preserve">Apifiny</w:t>
+        <w:t xml:space="preserve">Design&amp;Desktop</w:t>
       </w:r>
       <w:r>
         <w:rPr>
@@ -567,7 +526,7 @@
           <w:sz w:val="19"/>
           <w:szCs w:val="19"/>
         </w:rPr>
-        <w:t xml:space="preserve">	Feb 2023 – Dec 2024</w:t>
+        <w:t xml:space="preserve">	Jan 2025 – Jul 2025</w:t>
       </w:r>
     </w:p>
     <w:p>
@@ -597,7 +556,7 @@
           <w:sz w:val="19"/>
           <w:szCs w:val="19"/>
         </w:rPr>
-        <w:t xml:space="preserve">	Islamabad</w:t>
+        <w:t xml:space="preserve">	Remote (Germany)</w:t>
       </w:r>
     </w:p>
     <w:p>
@@ -618,29 +577,7 @@
           <w:sz w:val="20"/>
           <w:szCs w:val="20"/>
         </w:rPr>
-        <w:t xml:space="preserve">Led Diffed.gg (diffed-swart.vercel.app), a gaming coaching marketplace with checkout, live provider matching, wallets, payouts and admin tools. Shipped in </w:t>
-      </w:r>
-      <w:r>
-        <w:rPr>
-          <w:rFonts w:ascii="Calibri" w:cs="Calibri" w:eastAsia="Calibri" w:hAnsi="Calibri"/>
-          <w:b/>
-          <w:bCs/>
-          <w:color w:val="111111"/>
-          <w:sz w:val="20"/>
-          <w:szCs w:val="20"/>
-        </w:rPr>
-        <w:t xml:space="preserve">about 2 months</w:t>
-      </w:r>
-      <w:r>
-        <w:rPr>
-          <w:rFonts w:ascii="Calibri" w:cs="Calibri" w:eastAsia="Calibri" w:hAnsi="Calibri"/>
-          <w:b w:val="false"/>
-          <w:bCs w:val="false"/>
-          <w:color w:val="111111"/>
-          <w:sz w:val="20"/>
-          <w:szCs w:val="20"/>
-        </w:rPr>
-        <w:t xml:space="preserve"> with a team of three.</w:t>
+        <w:t xml:space="preserve">Built an AI integrated reel generator and shipped its n8n workflow that posts finished reels to Instagram on a schedule.</w:t>
       </w:r>
     </w:p>
     <w:p>
@@ -661,7 +598,29 @@
           <w:sz w:val="20"/>
           <w:szCs w:val="20"/>
         </w:rPr>
-        <w:t xml:space="preserve">Designed a config-driven rank engine so admins can add any game's rank system without code changes.</w:t>
+        <w:t xml:space="preserve">Rebuilt the in-browser video pipeline on MediaBunny. Render time went from 2–10 minutes to </w:t>
+      </w:r>
+      <w:r>
+        <w:rPr>
+          <w:rFonts w:ascii="Calibri" w:cs="Calibri" w:eastAsia="Calibri" w:hAnsi="Calibri"/>
+          <w:b/>
+          <w:bCs/>
+          <w:color w:val="111111"/>
+          <w:sz w:val="20"/>
+          <w:szCs w:val="20"/>
+        </w:rPr>
+        <w:t xml:space="preserve">about 10 seconds</w:t>
+      </w:r>
+      <w:r>
+        <w:rPr>
+          <w:rFonts w:ascii="Calibri" w:cs="Calibri" w:eastAsia="Calibri" w:hAnsi="Calibri"/>
+          <w:b w:val="false"/>
+          <w:bCs w:val="false"/>
+          <w:color w:val="111111"/>
+          <w:sz w:val="20"/>
+          <w:szCs w:val="20"/>
+        </w:rPr>
+        <w:t xml:space="preserve"> per clip.</w:t>
       </w:r>
     </w:p>
     <w:p>
@@ -682,65 +641,29 @@
           <w:sz w:val="20"/>
           <w:szCs w:val="20"/>
         </w:rPr>
-        <w:t xml:space="preserve">Owned client SaaS builds end to end: schema, API, frontend and deployment.</w:t>
-      </w:r>
-    </w:p>
-    <w:p>
-      <w:pPr>
-        <w:tabs>
-          <w:tab w:val="right" w:pos="10800"/>
-        </w:tabs>
-        <w:spacing w:after="0" w:before="100"/>
-      </w:pPr>
-      <w:r>
-        <w:rPr>
-          <w:rFonts w:ascii="Calibri" w:cs="Calibri" w:eastAsia="Calibri" w:hAnsi="Calibri"/>
-          <w:b/>
-          <w:bCs/>
-          <w:color w:val="111111"/>
-          <w:sz w:val="21"/>
-          <w:szCs w:val="21"/>
-        </w:rPr>
-        <w:t xml:space="preserve">Apifiny</w:t>
-      </w:r>
-      <w:r>
-        <w:rPr>
-          <w:rFonts w:ascii="Calibri" w:cs="Calibri" w:eastAsia="Calibri" w:hAnsi="Calibri"/>
-          <w:color w:val="555555"/>
-          <w:sz w:val="19"/>
-          <w:szCs w:val="19"/>
-        </w:rPr>
-        <w:t xml:space="preserve">	Dec 2021 – Feb 2022</w:t>
-      </w:r>
-    </w:p>
-    <w:p>
-      <w:pPr>
-        <w:tabs>
-          <w:tab w:val="right" w:pos="10800"/>
-        </w:tabs>
-        <w:spacing w:after="0" w:before="0"/>
-      </w:pPr>
-      <w:r>
-        <w:rPr>
-          <w:rFonts w:ascii="Calibri" w:cs="Calibri" w:eastAsia="Calibri" w:hAnsi="Calibri"/>
-          <w:i/>
-          <w:iCs/>
-          <w:color w:val="111111"/>
-          <w:sz w:val="21"/>
-          <w:szCs w:val="21"/>
-        </w:rPr>
-        <w:t xml:space="preserve">Full-Stack Engineer Intern</w:t>
-      </w:r>
-      <w:r>
-        <w:rPr>
-          <w:rFonts w:ascii="Calibri" w:cs="Calibri" w:eastAsia="Calibri" w:hAnsi="Calibri"/>
-          <w:i/>
-          <w:iCs/>
-          <w:color w:val="555555"/>
-          <w:sz w:val="19"/>
-          <w:szCs w:val="19"/>
-        </w:rPr>
-        <w:t xml:space="preserve">	Islamabad</w:t>
+        <w:t xml:space="preserve">Raised restaurant-data scraping throughput by </w:t>
+      </w:r>
+      <w:r>
+        <w:rPr>
+          <w:rFonts w:ascii="Calibri" w:cs="Calibri" w:eastAsia="Calibri" w:hAnsi="Calibri"/>
+          <w:b/>
+          <w:bCs/>
+          <w:color w:val="111111"/>
+          <w:sz w:val="20"/>
+          <w:szCs w:val="20"/>
+        </w:rPr>
+        <w:t xml:space="preserve">80%</w:t>
+      </w:r>
+      <w:r>
+        <w:rPr>
+          <w:rFonts w:ascii="Calibri" w:cs="Calibri" w:eastAsia="Calibri" w:hAnsi="Calibri"/>
+          <w:b w:val="false"/>
+          <w:bCs w:val="false"/>
+          <w:color w:val="111111"/>
+          <w:sz w:val="20"/>
+          <w:szCs w:val="20"/>
+        </w:rPr>
+        <w:t xml:space="preserve"> with parallel headless Chromium workers for a listings dashboard.</w:t>
       </w:r>
     </w:p>
     <w:p>
@@ -761,6 +684,228 @@
           <w:sz w:val="20"/>
           <w:szCs w:val="20"/>
         </w:rPr>
+        <w:t xml:space="preserve">Shipped per-warehouse delivery pricing and checkout address validation across 12,000 postal codes for a German B2B marketplace.</w:t>
+      </w:r>
+    </w:p>
+    <w:p>
+      <w:pPr>
+        <w:tabs>
+          <w:tab w:val="right" w:pos="10800"/>
+        </w:tabs>
+        <w:spacing w:after="0" w:before="100"/>
+      </w:pPr>
+      <w:r>
+        <w:rPr>
+          <w:rFonts w:ascii="Calibri" w:cs="Calibri" w:eastAsia="Calibri" w:hAnsi="Calibri"/>
+          <w:b/>
+          <w:bCs/>
+          <w:color w:val="111111"/>
+          <w:sz w:val="21"/>
+          <w:szCs w:val="21"/>
+        </w:rPr>
+        <w:t xml:space="preserve">Apifiny</w:t>
+      </w:r>
+      <w:r>
+        <w:rPr>
+          <w:rFonts w:ascii="Calibri" w:cs="Calibri" w:eastAsia="Calibri" w:hAnsi="Calibri"/>
+          <w:color w:val="555555"/>
+          <w:sz w:val="19"/>
+          <w:szCs w:val="19"/>
+        </w:rPr>
+        <w:t xml:space="preserve">	Feb 2023 – Dec 2024</w:t>
+      </w:r>
+    </w:p>
+    <w:p>
+      <w:pPr>
+        <w:tabs>
+          <w:tab w:val="right" w:pos="10800"/>
+        </w:tabs>
+        <w:spacing w:after="0" w:before="0"/>
+      </w:pPr>
+      <w:r>
+        <w:rPr>
+          <w:rFonts w:ascii="Calibri" w:cs="Calibri" w:eastAsia="Calibri" w:hAnsi="Calibri"/>
+          <w:i/>
+          <w:iCs/>
+          <w:color w:val="111111"/>
+          <w:sz w:val="21"/>
+          <w:szCs w:val="21"/>
+        </w:rPr>
+        <w:t xml:space="preserve">Full-Stack Engineer</w:t>
+      </w:r>
+      <w:r>
+        <w:rPr>
+          <w:rFonts w:ascii="Calibri" w:cs="Calibri" w:eastAsia="Calibri" w:hAnsi="Calibri"/>
+          <w:i/>
+          <w:iCs/>
+          <w:color w:val="555555"/>
+          <w:sz w:val="19"/>
+          <w:szCs w:val="19"/>
+        </w:rPr>
+        <w:t xml:space="preserve">	Islamabad</w:t>
+      </w:r>
+    </w:p>
+    <w:p>
+      <w:pPr>
+        <w:pStyle w:val="ListParagraph"/>
+        <w:numPr>
+          <w:ilvl w:val="0"/>
+          <w:numId w:val="2"/>
+        </w:numPr>
+        <w:spacing w:after="20"/>
+      </w:pPr>
+      <w:r>
+        <w:rPr>
+          <w:rFonts w:ascii="Calibri" w:cs="Calibri" w:eastAsia="Calibri" w:hAnsi="Calibri"/>
+          <w:b w:val="false"/>
+          <w:bCs w:val="false"/>
+          <w:color w:val="111111"/>
+          <w:sz w:val="20"/>
+          <w:szCs w:val="20"/>
+        </w:rPr>
+        <w:t xml:space="preserve">Led Diffed.gg (diffed-swart.vercel.app), a gaming coaching marketplace with checkout, live provider matching, wallets, payouts and admin tools. Shipped in </w:t>
+      </w:r>
+      <w:r>
+        <w:rPr>
+          <w:rFonts w:ascii="Calibri" w:cs="Calibri" w:eastAsia="Calibri" w:hAnsi="Calibri"/>
+          <w:b/>
+          <w:bCs/>
+          <w:color w:val="111111"/>
+          <w:sz w:val="20"/>
+          <w:szCs w:val="20"/>
+        </w:rPr>
+        <w:t xml:space="preserve">about 2 months</w:t>
+      </w:r>
+      <w:r>
+        <w:rPr>
+          <w:rFonts w:ascii="Calibri" w:cs="Calibri" w:eastAsia="Calibri" w:hAnsi="Calibri"/>
+          <w:b w:val="false"/>
+          <w:bCs w:val="false"/>
+          <w:color w:val="111111"/>
+          <w:sz w:val="20"/>
+          <w:szCs w:val="20"/>
+        </w:rPr>
+        <w:t xml:space="preserve"> with a team of three.</w:t>
+      </w:r>
+    </w:p>
+    <w:p>
+      <w:pPr>
+        <w:pStyle w:val="ListParagraph"/>
+        <w:numPr>
+          <w:ilvl w:val="0"/>
+          <w:numId w:val="2"/>
+        </w:numPr>
+        <w:spacing w:after="20"/>
+      </w:pPr>
+      <w:r>
+        <w:rPr>
+          <w:rFonts w:ascii="Calibri" w:cs="Calibri" w:eastAsia="Calibri" w:hAnsi="Calibri"/>
+          <w:b w:val="false"/>
+          <w:bCs w:val="false"/>
+          <w:color w:val="111111"/>
+          <w:sz w:val="20"/>
+          <w:szCs w:val="20"/>
+        </w:rPr>
+        <w:t xml:space="preserve">Designed a config-driven rank engine so admins can add any game's rank system without code changes.</w:t>
+      </w:r>
+    </w:p>
+    <w:p>
+      <w:pPr>
+        <w:pStyle w:val="ListParagraph"/>
+        <w:numPr>
+          <w:ilvl w:val="0"/>
+          <w:numId w:val="2"/>
+        </w:numPr>
+        <w:spacing w:after="20"/>
+      </w:pPr>
+      <w:r>
+        <w:rPr>
+          <w:rFonts w:ascii="Calibri" w:cs="Calibri" w:eastAsia="Calibri" w:hAnsi="Calibri"/>
+          <w:b w:val="false"/>
+          <w:bCs w:val="false"/>
+          <w:color w:val="111111"/>
+          <w:sz w:val="20"/>
+          <w:szCs w:val="20"/>
+        </w:rPr>
+        <w:t xml:space="preserve">Owned client SaaS builds end to end: schema, API, frontend and deployment.</w:t>
+      </w:r>
+    </w:p>
+    <w:p>
+      <w:pPr>
+        <w:tabs>
+          <w:tab w:val="right" w:pos="10800"/>
+        </w:tabs>
+        <w:spacing w:after="0" w:before="100"/>
+      </w:pPr>
+      <w:r>
+        <w:rPr>
+          <w:rFonts w:ascii="Calibri" w:cs="Calibri" w:eastAsia="Calibri" w:hAnsi="Calibri"/>
+          <w:b/>
+          <w:bCs/>
+          <w:color w:val="111111"/>
+          <w:sz w:val="21"/>
+          <w:szCs w:val="21"/>
+        </w:rPr>
+        <w:t xml:space="preserve">Apifiny</w:t>
+      </w:r>
+      <w:r>
+        <w:rPr>
+          <w:rFonts w:ascii="Calibri" w:cs="Calibri" w:eastAsia="Calibri" w:hAnsi="Calibri"/>
+          <w:color w:val="555555"/>
+          <w:sz w:val="19"/>
+          <w:szCs w:val="19"/>
+        </w:rPr>
+        <w:t xml:space="preserve">	Dec 2021 – Feb 2022</w:t>
+      </w:r>
+    </w:p>
+    <w:p>
+      <w:pPr>
+        <w:tabs>
+          <w:tab w:val="right" w:pos="10800"/>
+        </w:tabs>
+        <w:spacing w:after="0" w:before="0"/>
+      </w:pPr>
+      <w:r>
+        <w:rPr>
+          <w:rFonts w:ascii="Calibri" w:cs="Calibri" w:eastAsia="Calibri" w:hAnsi="Calibri"/>
+          <w:i/>
+          <w:iCs/>
+          <w:color w:val="111111"/>
+          <w:sz w:val="21"/>
+          <w:szCs w:val="21"/>
+        </w:rPr>
+        <w:t xml:space="preserve">Full-Stack Engineer Intern</w:t>
+      </w:r>
+      <w:r>
+        <w:rPr>
+          <w:rFonts w:ascii="Calibri" w:cs="Calibri" w:eastAsia="Calibri" w:hAnsi="Calibri"/>
+          <w:i/>
+          <w:iCs/>
+          <w:color w:val="555555"/>
+          <w:sz w:val="19"/>
+          <w:szCs w:val="19"/>
+        </w:rPr>
+        <w:t xml:space="preserve">	Islamabad</w:t>
+      </w:r>
+    </w:p>
+    <w:p>
+      <w:pPr>
+        <w:pStyle w:val="ListParagraph"/>
+        <w:numPr>
+          <w:ilvl w:val="0"/>
+          <w:numId w:val="2"/>
+        </w:numPr>
+        <w:spacing w:after="20"/>
+      </w:pPr>
+      <w:r>
+        <w:rPr>
+          <w:rFonts w:ascii="Calibri" w:cs="Calibri" w:eastAsia="Calibri" w:hAnsi="Calibri"/>
+          <w:b w:val="false"/>
+          <w:bCs w:val="false"/>
+          <w:color w:val="111111"/>
+          <w:sz w:val="20"/>
+          <w:szCs w:val="20"/>
+        </w:rPr>
         <w:t xml:space="preserve">Shipped production features across several client B2B SaaS products, frontend and backend.</w:t>
       </w:r>
     </w:p>
@@ -797,7 +942,7 @@
           <w:sz w:val="21"/>
           <w:szCs w:val="21"/>
         </w:rPr>
-        <w:t xml:space="preserve">Satraj · fuel billing, dispatch to QuickBooks</w:t>
+        <w:t xml:space="preserve">Indiecator · revenue analytics</w:t>
       </w:r>
       <w:r>
         <w:rPr>
@@ -808,57 +953,7 @@
         </w:rPr>
         <w:t xml:space="preserve">  |  </w:t>
       </w:r>
-      <w:hyperlink w:history="1" r:id="rId5lyh3jwlnkkz6miap1fia">
-        <w:r>
-          <w:rPr>
-            <w:rFonts w:ascii="Calibri" w:cs="Calibri" w:eastAsia="Calibri" w:hAnsi="Calibri"/>
-            <w:color w:val="111111"/>
-            <w:sz w:val="20"/>
-            <w:szCs w:val="20"/>
-            <w:u w:val="single"/>
-          </w:rPr>
-          <w:t xml:space="preserve">satraj.inc</w:t>
-        </w:r>
-      </w:hyperlink>
-    </w:p>
-    <w:p>
-      <w:r>
-        <w:rPr>
-          <w:rFonts w:ascii="Calibri" w:cs="Calibri" w:eastAsia="Calibri" w:hAnsi="Calibri"/>
-          <w:b w:val="false"/>
-          <w:bCs w:val="false"/>
-          <w:color w:val="111111"/>
-          <w:sz w:val="20"/>
-          <w:szCs w:val="20"/>
-        </w:rPr>
-        <w:t xml:space="preserve">Daily DTN pricing, delivery tickets from DTN and Samsara, an office review queue, and QuickBooks Desktop invoice sync. Live in production.</w:t>
-      </w:r>
-    </w:p>
-    <w:p>
-      <w:pPr>
-        <w:spacing w:before="60"/>
-      </w:pPr>
-      <w:r>
-        <w:rPr>
-          <w:rFonts w:ascii="Calibri" w:cs="Calibri" w:eastAsia="Calibri" w:hAnsi="Calibri"/>
-          <w:b/>
-          <w:bCs/>
-          <w:color w:val="111111"/>
-          <w:sz w:val="21"/>
-          <w:szCs w:val="21"/>
-        </w:rPr>
-        <w:t xml:space="preserve">Indiecator · revenue analytics</w:t>
-      </w:r>
-      <w:r>
-        <w:rPr>
-          <w:rFonts w:ascii="Calibri" w:cs="Calibri" w:eastAsia="Calibri" w:hAnsi="Calibri"/>
-          <w:color w:val="555555"/>
-          <w:sz w:val="20"/>
-          <w:szCs w:val="20"/>
-        </w:rPr>
-        <w:t xml:space="preserve">  |  </w:t>
-      </w:r>
-      <w:hyperlink w:history="1" r:id="rIdlic9o2zz5mnyell8ub5hq">
+      <w:hyperlink w:history="1" r:id="rId87yfrc17ngph2mj_devf0">
         <w:r>
           <w:rPr>
             <w:rFonts w:ascii="Calibri" w:cs="Calibri" w:eastAsia="Calibri" w:hAnsi="Calibri"/>
@@ -908,7 +1003,7 @@
         </w:rPr>
         <w:t xml:space="preserve">  |  </w:t>
       </w:r>
-      <w:hyperlink w:history="1" r:id="rIdbcyjamicoup3im5cdwl0n">
+      <w:hyperlink w:history="1" r:id="rIdf3fblhxhm4hys7ro4uvug">
         <w:r>
           <w:rPr>
             <w:rFonts w:ascii="Calibri" w:cs="Calibri" w:eastAsia="Calibri" w:hAnsi="Calibri"/>
@@ -931,57 +1026,7 @@
           <w:sz w:val="20"/>
           <w:szCs w:val="20"/>
         </w:rPr>
-        <w:t xml:space="preserve">Card and PayPal checkout, live chat, provider wallets and admin verification, with separate apps for customers, providers and admins.</w:t>
-      </w:r>
-    </w:p>
-    <w:p>
-      <w:pPr>
-        <w:spacing w:before="60"/>
-      </w:pPr>
-      <w:r>
-        <w:rPr>
-          <w:rFonts w:ascii="Calibri" w:cs="Calibri" w:eastAsia="Calibri" w:hAnsi="Calibri"/>
-          <w:b/>
-          <w:bCs/>
-          <w:color w:val="111111"/>
-          <w:sz w:val="21"/>
-          <w:szCs w:val="21"/>
-        </w:rPr>
-        <w:t xml:space="preserve">AI reel generator · n8n posting</w:t>
-      </w:r>
-      <w:r>
-        <w:rPr>
-          <w:rFonts w:ascii="Calibri" w:cs="Calibri" w:eastAsia="Calibri" w:hAnsi="Calibri"/>
-          <w:color w:val="555555"/>
-          <w:sz w:val="20"/>
-          <w:szCs w:val="20"/>
-        </w:rPr>
-        <w:t xml:space="preserve">  |  </w:t>
-      </w:r>
-      <w:hyperlink w:history="1" r:id="rIdwga_s6lmsir1kfvz9q6oi">
-        <w:r>
-          <w:rPr>
-            <w:rFonts w:ascii="Calibri" w:cs="Calibri" w:eastAsia="Calibri" w:hAnsi="Calibri"/>
-            <w:color w:val="111111"/>
-            <w:sz w:val="20"/>
-            <w:szCs w:val="20"/>
-            <w:u w:val="single"/>
-          </w:rPr>
-          <w:t xml:space="preserve">uzairsaleem.dev/#work</w:t>
-        </w:r>
-      </w:hyperlink>
-    </w:p>
-    <w:p>
-      <w:r>
-        <w:rPr>
-          <w:rFonts w:ascii="Calibri" w:cs="Calibri" w:eastAsia="Calibri" w:hAnsi="Calibri"/>
-          <w:b w:val="false"/>
-          <w:bCs w:val="false"/>
-          <w:color w:val="111111"/>
-          <w:sz w:val="20"/>
-          <w:szCs w:val="20"/>
-        </w:rPr>
-        <w:t xml:space="preserve">Remotion renders, MediaBunny encoding and an n8n workflow that publishes reels to Instagram on a schedule.</w:t>
+        <w:t xml:space="preserve">Card and PayPal checkout, live chat, provider wallets and admin verification.</w:t>
       </w:r>
     </w:p>
     <w:p>

</xml_diff>

<commit_message>
Redesign the site for a job hunt: dark theme, plain copy, case studies
New dark theme with one lime accent. The hero says what he is and what he has
shipped in plain words, with the three nouns linking to their project tiles.
An at-a-glance strip covers role, stack, location and availability. Project
tiles are cut to one line, one checkable result and a few tags. Depth moves to
/work/[slug] case studies (problem, what I built, the hard part, results).

The old fuel-sales pages and their components are removed, and /demo, /fuel and
/fuel/demo redirect to /work/satraj. The blog is restyled and indexable again.
Résumé summary reworded, PDF and Word file regenerated, still one page. Tests,
sitemap, OG image and README updated.

Co-Authored-By: Claude Sonnet 5.5 <noreply@anthropic.com>
</commit_message>
<xml_diff>
--- a/public/uzair-saleem-resume.docx
+++ b/public/uzair-saleem-resume.docx
@@ -58,7 +58,7 @@
         </w:rPr>
         <w:t xml:space="preserve">  |  </w:t>
       </w:r>
-      <w:hyperlink w:history="1" r:id="rIdmzpg7x_qeyxjspstg1ndm">
+      <w:hyperlink w:history="1" r:id="rId993dgkaysxmgrvokjppyz">
         <w:r>
           <w:rPr>
             <w:rFonts w:ascii="Calibri" w:cs="Calibri" w:eastAsia="Calibri" w:hAnsi="Calibri"/>
@@ -79,7 +79,7 @@
         </w:rPr>
         <w:t xml:space="preserve">  |  </w:t>
       </w:r>
-      <w:hyperlink w:history="1" r:id="rIdh_h9gh1km70aioqqhnhvy">
+      <w:hyperlink w:history="1" r:id="rIdj1omfcsy5toayyl8yly48">
         <w:r>
           <w:rPr>
             <w:rFonts w:ascii="Calibri" w:cs="Calibri" w:eastAsia="Calibri" w:hAnsi="Calibri"/>
@@ -100,7 +100,7 @@
         </w:rPr>
         <w:t xml:space="preserve">  |  </w:t>
       </w:r>
-      <w:hyperlink w:history="1" r:id="rId7lnotrpqncbmvt9dno5sm">
+      <w:hyperlink w:history="1" r:id="rIdxctk_xg36mcfjjopbx7sw">
         <w:r>
           <w:rPr>
             <w:rFonts w:ascii="Calibri" w:cs="Calibri" w:eastAsia="Calibri" w:hAnsi="Calibri"/>
@@ -121,7 +121,7 @@
         </w:rPr>
         <w:t xml:space="preserve">  |  </w:t>
       </w:r>
-      <w:hyperlink w:history="1" r:id="rIdwwegwqvvd5essceqa_z9t">
+      <w:hyperlink w:history="1" r:id="rIdjo4qwzzetgaovfsfundq8">
         <w:r>
           <w:rPr>
             <w:rFonts w:ascii="Calibri" w:cs="Calibri" w:eastAsia="Calibri" w:hAnsi="Calibri"/>
@@ -142,7 +142,7 @@
         </w:rPr>
         <w:t xml:space="preserve">  |  </w:t>
       </w:r>
-      <w:hyperlink w:history="1" r:id="rId1f4q8gkpnq7zpvcqst4tq">
+      <w:hyperlink w:history="1" r:id="rIds4nlgwxdgk_d2besku7gy">
         <w:r>
           <w:rPr>
             <w:rFonts w:ascii="Calibri" w:cs="Calibri" w:eastAsia="Calibri" w:hAnsi="Calibri"/>
@@ -168,7 +168,7 @@
           <w:sz w:val="20"/>
           <w:szCs w:val="20"/>
         </w:rPr>
-        <w:t xml:space="preserve">Full-stack engineer who ships to production. I build data pipelines, billing workflows and AI automations with Next.js, Node, PostgreSQL and n8n. I have been writing production code since 2021 for clients in the US and Europe, and I work US hours from Islamabad.</w:t>
+        <w:t xml:space="preserve">Full-stack engineer writing production code since 2021. I have shipped a billing system for a fuel distributor, the data pipelines behind a revenue analytics product, and a gaming marketplace with payouts, using Next.js, TypeScript, Node and PostgreSQL. I work with teams in the US and Europe, on US hours from Islamabad.</w:t>
       </w:r>
     </w:p>
     <w:p>
@@ -198,7 +198,7 @@
         </w:tabs>
         <w:spacing w:after="0" w:before="100"/>
       </w:pPr>
-      <w:hyperlink w:history="1" r:id="rIdfurn0im8w3k6ile_wg6zd">
+      <w:hyperlink w:history="1" r:id="rIdokfls-2bt10ddiz9otml-">
         <w:r>
           <w:rPr>
             <w:rFonts w:ascii="Calibri" w:cs="Calibri" w:eastAsia="Calibri" w:hAnsi="Calibri"/>
@@ -953,7 +953,7 @@
         </w:rPr>
         <w:t xml:space="preserve">  |  </w:t>
       </w:r>
-      <w:hyperlink w:history="1" r:id="rId87yfrc17ngph2mj_devf0">
+      <w:hyperlink w:history="1" r:id="rIdpqkodh12wxpwzdj20hkhc">
         <w:r>
           <w:rPr>
             <w:rFonts w:ascii="Calibri" w:cs="Calibri" w:eastAsia="Calibri" w:hAnsi="Calibri"/>
@@ -1003,7 +1003,7 @@
         </w:rPr>
         <w:t xml:space="preserve">  |  </w:t>
       </w:r>
-      <w:hyperlink w:history="1" r:id="rIdf3fblhxhm4hys7ro4uvug">
+      <w:hyperlink w:history="1" r:id="rId0wufkindljj1x5fyzeqdn">
         <w:r>
           <w:rPr>
             <w:rFonts w:ascii="Calibri" w:cs="Calibri" w:eastAsia="Calibri" w:hAnsi="Calibri"/>

</xml_diff>

<commit_message>
Drop education dates, list the degree as BSCS, say 3 to 4 years
Education shows no dates on the site, the résumé page, the PDF or the Word
file, and the degree reads BSCS (Bachelor of Computer Science). The résumé
summary and the home page hero say 3 to 4 years of production experience
instead of a start year. PDF and Word file regenerated, still one page.

Co-Authored-By: Claude Sonnet 5.5 <noreply@anthropic.com>
</commit_message>
<xml_diff>
--- a/public/uzair-saleem-resume.docx
+++ b/public/uzair-saleem-resume.docx
@@ -58,7 +58,7 @@
         </w:rPr>
         <w:t xml:space="preserve">  |  </w:t>
       </w:r>
-      <w:hyperlink w:history="1" r:id="rId993dgkaysxmgrvokjppyz">
+      <w:hyperlink w:history="1" r:id="rId3kyz9e1va-cco3kjfbtr1">
         <w:r>
           <w:rPr>
             <w:rFonts w:ascii="Calibri" w:cs="Calibri" w:eastAsia="Calibri" w:hAnsi="Calibri"/>
@@ -79,7 +79,7 @@
         </w:rPr>
         <w:t xml:space="preserve">  |  </w:t>
       </w:r>
-      <w:hyperlink w:history="1" r:id="rIdj1omfcsy5toayyl8yly48">
+      <w:hyperlink w:history="1" r:id="rIdebb3ztkyv4kc_fmrem-q_">
         <w:r>
           <w:rPr>
             <w:rFonts w:ascii="Calibri" w:cs="Calibri" w:eastAsia="Calibri" w:hAnsi="Calibri"/>
@@ -100,7 +100,7 @@
         </w:rPr>
         <w:t xml:space="preserve">  |  </w:t>
       </w:r>
-      <w:hyperlink w:history="1" r:id="rIdxctk_xg36mcfjjopbx7sw">
+      <w:hyperlink w:history="1" r:id="rIdniwmumcottw6zvirkezob">
         <w:r>
           <w:rPr>
             <w:rFonts w:ascii="Calibri" w:cs="Calibri" w:eastAsia="Calibri" w:hAnsi="Calibri"/>
@@ -121,7 +121,7 @@
         </w:rPr>
         <w:t xml:space="preserve">  |  </w:t>
       </w:r>
-      <w:hyperlink w:history="1" r:id="rIdjo4qwzzetgaovfsfundq8">
+      <w:hyperlink w:history="1" r:id="rId3jds2fdztzvlpnsttlzww">
         <w:r>
           <w:rPr>
             <w:rFonts w:ascii="Calibri" w:cs="Calibri" w:eastAsia="Calibri" w:hAnsi="Calibri"/>
@@ -142,7 +142,7 @@
         </w:rPr>
         <w:t xml:space="preserve">  |  </w:t>
       </w:r>
-      <w:hyperlink w:history="1" r:id="rIds4nlgwxdgk_d2besku7gy">
+      <w:hyperlink w:history="1" r:id="rIdceepxhtuncr9sodhxzrb9">
         <w:r>
           <w:rPr>
             <w:rFonts w:ascii="Calibri" w:cs="Calibri" w:eastAsia="Calibri" w:hAnsi="Calibri"/>
@@ -168,7 +168,7 @@
           <w:sz w:val="20"/>
           <w:szCs w:val="20"/>
         </w:rPr>
-        <w:t xml:space="preserve">Full-stack engineer writing production code since 2021. I have shipped a billing system for a fuel distributor, the data pipelines behind a revenue analytics product, and a gaming marketplace with payouts, using Next.js, TypeScript, Node and PostgreSQL. I work with teams in the US and Europe, on US hours from Islamabad.</w:t>
+        <w:t xml:space="preserve">Full-stack engineer with 3 to 4 years of production experience. I have shipped a billing system for a fuel distributor, the data pipelines behind a revenue analytics product, and a gaming marketplace with payouts, using Next.js, TypeScript, Node and PostgreSQL. I work with teams in the US and Europe, on US hours from Islamabad.</w:t>
       </w:r>
     </w:p>
     <w:p>
@@ -198,7 +198,7 @@
         </w:tabs>
         <w:spacing w:after="0" w:before="100"/>
       </w:pPr>
-      <w:hyperlink w:history="1" r:id="rIdokfls-2bt10ddiz9otml-">
+      <w:hyperlink w:history="1" r:id="rId0lwmqxl4woqmy8hnibvno">
         <w:r>
           <w:rPr>
             <w:rFonts w:ascii="Calibri" w:cs="Calibri" w:eastAsia="Calibri" w:hAnsi="Calibri"/>
@@ -953,7 +953,7 @@
         </w:rPr>
         <w:t xml:space="preserve">  |  </w:t>
       </w:r>
-      <w:hyperlink w:history="1" r:id="rIdpqkodh12wxpwzdj20hkhc">
+      <w:hyperlink w:history="1" r:id="rIdvfq7om0gqr1icnyha_mtr">
         <w:r>
           <w:rPr>
             <w:rFonts w:ascii="Calibri" w:cs="Calibri" w:eastAsia="Calibri" w:hAnsi="Calibri"/>
@@ -1003,7 +1003,7 @@
         </w:rPr>
         <w:t xml:space="preserve">  |  </w:t>
       </w:r>
-      <w:hyperlink w:history="1" r:id="rId0wufkindljj1x5fyzeqdn">
+      <w:hyperlink w:history="1" r:id="rIdma3q9zcojfa3sh9jbegdn">
         <w:r>
           <w:rPr>
             <w:rFonts w:ascii="Calibri" w:cs="Calibri" w:eastAsia="Calibri" w:hAnsi="Calibri"/>
@@ -1219,7 +1219,7 @@
           <w:sz w:val="19"/>
           <w:szCs w:val="19"/>
         </w:rPr>
-        <w:t xml:space="preserve">	Feb 2019 – Jan 2023</w:t>
+        <w:t xml:space="preserve">	</w:t>
       </w:r>
     </w:p>
     <w:p>
@@ -1238,7 +1238,7 @@
           <w:sz w:val="21"/>
           <w:szCs w:val="21"/>
         </w:rPr>
-        <w:t xml:space="preserve">BS, Artificial Intelligence</w:t>
+        <w:t xml:space="preserve">BSCS (Bachelor of Computer Science)</w:t>
       </w:r>
       <w:r>
         <w:rPr>

</xml_diff>

<commit_message>
Date the Apifiny internship Dec 2022 to Jan 2023
Updated in the résumé data, so the /resume page, the PDF and the Word file
all agree. The internship now ends the month before the full-time role
starts. PDF and Word file regenerated, still one page.

Co-Authored-By: Claude Sonnet 5.5 <noreply@anthropic.com>
</commit_message>
<xml_diff>
--- a/public/uzair-saleem-resume.docx
+++ b/public/uzair-saleem-resume.docx
@@ -58,7 +58,7 @@
         </w:rPr>
         <w:t xml:space="preserve">  |  </w:t>
       </w:r>
-      <w:hyperlink w:history="1" r:id="rId3kyz9e1va-cco3kjfbtr1">
+      <w:hyperlink w:history="1" r:id="rIdhphsaqpyb35i7wosgdwng">
         <w:r>
           <w:rPr>
             <w:rFonts w:ascii="Calibri" w:cs="Calibri" w:eastAsia="Calibri" w:hAnsi="Calibri"/>
@@ -79,7 +79,7 @@
         </w:rPr>
         <w:t xml:space="preserve">  |  </w:t>
       </w:r>
-      <w:hyperlink w:history="1" r:id="rIdebb3ztkyv4kc_fmrem-q_">
+      <w:hyperlink w:history="1" r:id="rIdqvysz6rwf6t2s44u75unz">
         <w:r>
           <w:rPr>
             <w:rFonts w:ascii="Calibri" w:cs="Calibri" w:eastAsia="Calibri" w:hAnsi="Calibri"/>
@@ -100,7 +100,7 @@
         </w:rPr>
         <w:t xml:space="preserve">  |  </w:t>
       </w:r>
-      <w:hyperlink w:history="1" r:id="rIdniwmumcottw6zvirkezob">
+      <w:hyperlink w:history="1" r:id="rIdktzndbg6sqc24mw5p_flc">
         <w:r>
           <w:rPr>
             <w:rFonts w:ascii="Calibri" w:cs="Calibri" w:eastAsia="Calibri" w:hAnsi="Calibri"/>
@@ -121,7 +121,7 @@
         </w:rPr>
         <w:t xml:space="preserve">  |  </w:t>
       </w:r>
-      <w:hyperlink w:history="1" r:id="rId3jds2fdztzvlpnsttlzww">
+      <w:hyperlink w:history="1" r:id="rIdzbnwrxe_ovl77gkc1bymi">
         <w:r>
           <w:rPr>
             <w:rFonts w:ascii="Calibri" w:cs="Calibri" w:eastAsia="Calibri" w:hAnsi="Calibri"/>
@@ -142,7 +142,7 @@
         </w:rPr>
         <w:t xml:space="preserve">  |  </w:t>
       </w:r>
-      <w:hyperlink w:history="1" r:id="rIdceepxhtuncr9sodhxzrb9">
+      <w:hyperlink w:history="1" r:id="rId0oimhblkk0qfxedav2jo5">
         <w:r>
           <w:rPr>
             <w:rFonts w:ascii="Calibri" w:cs="Calibri" w:eastAsia="Calibri" w:hAnsi="Calibri"/>
@@ -198,7 +198,7 @@
         </w:tabs>
         <w:spacing w:after="0" w:before="100"/>
       </w:pPr>
-      <w:hyperlink w:history="1" r:id="rId0lwmqxl4woqmy8hnibvno">
+      <w:hyperlink w:history="1" r:id="rId_yfvgyaxzqmaplhsk5uwp">
         <w:r>
           <w:rPr>
             <w:rFonts w:ascii="Calibri" w:cs="Calibri" w:eastAsia="Calibri" w:hAnsi="Calibri"/>
@@ -855,7 +855,7 @@
           <w:sz w:val="19"/>
           <w:szCs w:val="19"/>
         </w:rPr>
-        <w:t xml:space="preserve">	Dec 2021 – Feb 2022</w:t>
+        <w:t xml:space="preserve">	Dec 2022 – Jan 2023</w:t>
       </w:r>
     </w:p>
     <w:p>
@@ -953,7 +953,7 @@
         </w:rPr>
         <w:t xml:space="preserve">  |  </w:t>
       </w:r>
-      <w:hyperlink w:history="1" r:id="rIdvfq7om0gqr1icnyha_mtr">
+      <w:hyperlink w:history="1" r:id="rIdbqhxpbgkjhrtwqkejw4l1">
         <w:r>
           <w:rPr>
             <w:rFonts w:ascii="Calibri" w:cs="Calibri" w:eastAsia="Calibri" w:hAnsi="Calibri"/>
@@ -1003,7 +1003,7 @@
         </w:rPr>
         <w:t xml:space="preserve">  |  </w:t>
       </w:r>
-      <w:hyperlink w:history="1" r:id="rIdma3q9zcojfa3sh9jbegdn">
+      <w:hyperlink w:history="1" r:id="rIdu8u93gcalegwzcfvherks">
         <w:r>
           <w:rPr>
             <w:rFonts w:ascii="Calibri" w:cs="Calibri" w:eastAsia="Calibri" w:hAnsi="Calibri"/>

</xml_diff>